<commit_message>
Remove design-science framing; fix Principle 3 numbers, reference order/dates, H1 evidence; simplify structure
Co-Authored-By: Claude Sonnet 5.5 <noreply@anthropic.com>
Claude-Session: https://claude.ai/code/session_01VRbK37d38KZhVAbWS4xw4x
</commit_message>
<xml_diff>
--- a/llm-count-study/ISR_contribution_statement.docx
+++ b/llm-count-study/ISR_contribution_statement.docx
@@ -37,7 +37,7 @@
           <w:b w:val="0"/>
           <w:i w:val="0"/>
         </w:rPr>
-        <w:t>Organizations are placing generative-AI "digital twins" of customers inside their marketing analytics systems, yet the information systems literature offers no design knowledge for such artifacts and no account of how organizations should validate and govern them. Existing work on LLM-based synthetic respondents evaluates the model's answers, mostly ratings, choices, and stated willingness to pay, and finds that the answers are plausible but too uniform. It does not treat the simulator as an IT artifact that an organization designs, deploys, and holds accountable for a decision.</w:t>
+        <w:t>Organizations are placing generative-AI "digital twins" of customers inside their marketing analytics systems, yet the information systems literature offers no design constraints for such artifacts and no account of how organizations should validate and govern them. Existing work on LLM-based synthetic respondents evaluates the model's answers, mostly ratings, choices, and stated willingness to pay, and finds that the answers are plausible but too uniform. It does not treat the simulator as an IT artifact that an organization designs, deploys, and holds accountable for a decision.</w:t>
       </w:r>
     </w:p>
     <w:p>
@@ -49,7 +49,7 @@
           <w:b w:val="0"/>
           <w:i w:val="0"/>
         </w:rPr>
-        <w:t>Our paper contributes to the information systems literature in four ways. First, it develops design knowledge for synthetic-customer systems. Two propositions state a design constraint and a calibration mechanism: a persona-conditioned component that returns deterministic answers can carry only the customer heterogeneity that its persona describes, and heterogeneity supplied from outside the model must be calibrated against the model's own variation to avoid double counting. A third proposition links the constraint to the concentration of purchases among heavy buyers. Although the algebra is elementary, the propositions are impossibility and calibration results for the levers an organization controls (prompt, persona, model choice, decoding settings), they hold regardless of the model used, and they yield testable predictions.</w:t>
+        <w:t>Our paper contributes to the information systems literature in four ways. First, it develops design constraints for synthetic-customer systems. Two propositions state a design constraint and a calibration mechanism: a persona-conditioned component that returns deterministic answers can carry only the customer heterogeneity that its persona describes, and heterogeneity supplied from outside the model must be calibrated against the model's own variation to avoid double counting. A third proposition links the constraint to the concentration of purchases among heavy buyers. Although the algebra is elementary, the propositions are impossibility and calibration results for the levers an organization controls (prompt, persona, model choice, decoding settings), they hold regardless of the model used, and they yield testable predictions.</w:t>
       </w:r>
     </w:p>
     <w:p>
@@ -85,7 +85,7 @@
           <w:b w:val="0"/>
           <w:i w:val="0"/>
         </w:rPr>
-        <w:t>Fourth, the paper derives five design principles, an acceptance-test protocol, and organizational arrangements: named ownership of reference data and pipeline, revalidation when a model, provider, or prompt changes, separation of synthetic from real data, continued randomized testing, and accountability assigned before use. These speak directly to research on IT artifacts, design science, task-technology fit, and the governance of AI-enabled decision support, and to the interface between information systems and marketing analytics.</w:t>
+        <w:t>Fourth, the paper derives five design principles, an acceptance-test protocol, and organizational arrangements: named ownership of reference data and pipeline, revalidation when a model, provider, or prompt changes, separation of synthetic from real data, continued randomized testing, and accountability assigned before use. These speak directly to research on IT artifacts, task-technology fit, and the governance of AI-enabled decision support, and to the interface between information systems and marketing analytics.</w:t>
       </w:r>
     </w:p>
     <w:sectPr>

</xml_diff>